<commit_message>
Make cover repository URL a bold blue underlined hyperlink
</commit_message>
<xml_diff>
--- a/report/SMS_Spam_Detection_Report.docx
+++ b/report/SMS_Spam_Detection_Report.docx
@@ -75,8 +75,17 @@
       <w:r>
         <w:t>Project repository</w:t>
         <w:br/>
-        <w:t>https://github.com/YuvrajC7/sms-spam-detection</w:t>
       </w:r>
+      <w:hyperlink r:id="rId13" w:history="1">
+        <w:r>
+          <w:rPr>
+            <w:b/>
+            <w:color w:val="0000FF"/>
+            <w:u w:val="single"/>
+          </w:rPr>
+          <w:t>https://github.com/YuvrajC7/sms-spam-detection</w:t>
+        </w:r>
+      </w:hyperlink>
     </w:p>
     <w:p>
       <w:pPr>

</xml_diff>